<commit_message>
runtime by decade mart
</commit_message>
<xml_diff>
--- a/docs/project_documentation.docx
+++ b/docs/project_documentation.docx
@@ -5326,6 +5326,258 @@
           </w:p>
         </w:tc>
       </w:tr>
+      <w:tr>
+        <w:tblPrEx>
+          <w:tblBorders>
+            <w:top w:val="single" w:color="auto" w:sz="4" w:space="0"/>
+            <w:left w:val="single" w:color="auto" w:sz="4" w:space="0"/>
+            <w:bottom w:val="single" w:color="auto" w:sz="4" w:space="0"/>
+            <w:right w:val="single" w:color="auto" w:sz="4" w:space="0"/>
+            <w:insideH w:val="single" w:color="auto" w:sz="4" w:space="0"/>
+            <w:insideV w:val="single" w:color="auto" w:sz="4" w:space="0"/>
+          </w:tblBorders>
+          <w:tblCellMar>
+            <w:top w:w="0" w:type="dxa"/>
+            <w:left w:w="108" w:type="dxa"/>
+            <w:bottom w:w="0" w:type="dxa"/>
+            <w:right w:w="108" w:type="dxa"/>
+          </w:tblCellMar>
+        </w:tblPrEx>
+        <w:tc>
+          <w:tcPr>
+            <w:tcW w:w="1853" w:type="dxa"/>
+            <w:vAlign w:val="center"/>
+          </w:tcPr>
+          <w:p>
+            <w:pPr>
+              <w:widowControl w:val="0"/>
+              <w:spacing w:beforeLines="0" w:afterLines="0"/>
+              <w:jc w:val="center"/>
+              <w:rPr>
+                <w:rFonts w:hint="default" w:ascii="Times New Roman" w:hAnsi="Times New Roman" w:eastAsia="Consolas" w:cs="Times New Roman"/>
+                <w:b/>
+                <w:bCs/>
+                <w:color w:val="auto"/>
+                <w:sz w:val="24"/>
+                <w:szCs w:val="24"/>
+                <w:u w:val="single"/>
+                <w:vertAlign w:val="baseline"/>
+                <w:lang w:val="en-US"/>
+              </w:rPr>
+            </w:pPr>
+            <w:r>
+              <w:rPr>
+                <w:rFonts w:hint="default" w:ascii="Times New Roman" w:hAnsi="Times New Roman" w:eastAsia="Consolas" w:cs="Times New Roman"/>
+                <w:b/>
+                <w:bCs/>
+                <w:color w:val="auto"/>
+                <w:sz w:val="24"/>
+                <w:szCs w:val="24"/>
+                <w:u w:val="single"/>
+                <w:vertAlign w:val="baseline"/>
+                <w:lang w:val="en-US"/>
+              </w:rPr>
+              <w:t>mart_runtime_by_decade</w:t>
+            </w:r>
+          </w:p>
+        </w:tc>
+        <w:tc>
+          <w:tcPr>
+            <w:tcW w:w="1601" w:type="dxa"/>
+          </w:tcPr>
+          <w:p>
+            <w:pPr>
+              <w:widowControl w:val="0"/>
+              <w:spacing w:beforeLines="0" w:afterLines="0"/>
+              <w:jc w:val="center"/>
+              <w:rPr>
+                <w:rFonts w:hint="default" w:ascii="Times New Roman" w:hAnsi="Times New Roman" w:eastAsia="Consolas"/>
+                <w:b w:val="0"/>
+                <w:bCs w:val="0"/>
+                <w:color w:val="auto"/>
+                <w:sz w:val="24"/>
+                <w:szCs w:val="24"/>
+                <w:u w:val="none"/>
+                <w:vertAlign w:val="baseline"/>
+                <w:lang w:val="en-US"/>
+              </w:rPr>
+            </w:pPr>
+            <w:r>
+              <w:rPr>
+                <w:rFonts w:hint="default" w:ascii="Times New Roman" w:hAnsi="Times New Roman" w:eastAsia="Consolas"/>
+                <w:b w:val="0"/>
+                <w:bCs w:val="0"/>
+                <w:color w:val="auto"/>
+                <w:sz w:val="24"/>
+                <w:szCs w:val="24"/>
+                <w:u w:val="none"/>
+                <w:vertAlign w:val="baseline"/>
+                <w:lang w:val="en-US"/>
+              </w:rPr>
+              <w:t>One row per release decade</w:t>
+            </w:r>
+          </w:p>
+        </w:tc>
+        <w:tc>
+          <w:tcPr>
+            <w:tcW w:w="1588" w:type="dxa"/>
+            <w:vAlign w:val="center"/>
+          </w:tcPr>
+          <w:p>
+            <w:pPr>
+              <w:widowControl w:val="0"/>
+              <w:spacing w:beforeLines="0" w:afterLines="0"/>
+              <w:jc w:val="center"/>
+              <w:rPr>
+                <w:rFonts w:hint="default" w:ascii="Times New Roman" w:hAnsi="Times New Roman" w:eastAsia="Consolas"/>
+                <w:b/>
+                <w:bCs/>
+                <w:color w:val="auto"/>
+                <w:sz w:val="24"/>
+                <w:szCs w:val="24"/>
+                <w:u w:val="none"/>
+                <w:vertAlign w:val="baseline"/>
+                <w:lang w:val="en-US"/>
+              </w:rPr>
+            </w:pPr>
+            <w:r>
+              <w:rPr>
+                <w:rFonts w:hint="default" w:ascii="Times New Roman" w:hAnsi="Times New Roman" w:eastAsia="Consolas"/>
+                <w:b/>
+                <w:bCs/>
+                <w:color w:val="auto"/>
+                <w:sz w:val="24"/>
+                <w:szCs w:val="24"/>
+                <w:u w:val="single"/>
+                <w:vertAlign w:val="baseline"/>
+                <w:lang w:val="en-US"/>
+              </w:rPr>
+              <w:t>decade</w:t>
+            </w:r>
+          </w:p>
+        </w:tc>
+        <w:tc>
+          <w:tcPr>
+            <w:tcW w:w="1702" w:type="dxa"/>
+            <w:vAlign w:val="center"/>
+          </w:tcPr>
+          <w:p>
+            <w:pPr>
+              <w:widowControl w:val="0"/>
+              <w:spacing w:beforeLines="0" w:afterLines="0"/>
+              <w:jc w:val="center"/>
+              <w:rPr>
+                <w:rFonts w:hint="default" w:ascii="Times New Roman" w:hAnsi="Times New Roman" w:eastAsia="Consolas"/>
+                <w:b/>
+                <w:bCs/>
+                <w:color w:val="auto"/>
+                <w:sz w:val="24"/>
+                <w:szCs w:val="24"/>
+                <w:u w:val="none"/>
+                <w:vertAlign w:val="baseline"/>
+                <w:lang w:val="en-US"/>
+              </w:rPr>
+            </w:pPr>
+            <w:r>
+              <w:rPr>
+                <w:rFonts w:hint="default" w:ascii="Times New Roman" w:hAnsi="Times New Roman" w:eastAsia="Consolas"/>
+                <w:b/>
+                <w:bCs/>
+                <w:color w:val="auto"/>
+                <w:sz w:val="24"/>
+                <w:szCs w:val="24"/>
+                <w:u w:val="none"/>
+                <w:vertAlign w:val="baseline"/>
+                <w:lang w:val="en-US"/>
+              </w:rPr>
+              <w:t>None</w:t>
+            </w:r>
+          </w:p>
+        </w:tc>
+        <w:tc>
+          <w:tcPr>
+            <w:tcW w:w="1576" w:type="dxa"/>
+            <w:vAlign w:val="center"/>
+          </w:tcPr>
+          <w:p>
+            <w:pPr>
+              <w:widowControl w:val="0"/>
+              <w:spacing w:beforeLines="0" w:afterLines="0"/>
+              <w:jc w:val="center"/>
+              <w:rPr>
+                <w:rFonts w:hint="default" w:ascii="Times New Roman" w:hAnsi="Times New Roman" w:eastAsia="Consolas"/>
+                <w:b/>
+                <w:bCs/>
+                <w:color w:val="auto"/>
+                <w:sz w:val="24"/>
+                <w:szCs w:val="24"/>
+                <w:u w:val="none"/>
+                <w:vertAlign w:val="baseline"/>
+                <w:lang w:val="en-US"/>
+              </w:rPr>
+            </w:pPr>
+            <w:r>
+              <w:rPr>
+                <w:rFonts w:hint="default" w:ascii="Times New Roman" w:hAnsi="Times New Roman" w:eastAsia="Consolas"/>
+                <w:b/>
+                <w:bCs/>
+                <w:color w:val="auto"/>
+                <w:sz w:val="24"/>
+                <w:szCs w:val="24"/>
+                <w:u w:val="none"/>
+                <w:vertAlign w:val="baseline"/>
+                <w:lang w:val="en-US"/>
+              </w:rPr>
+              <w:t>fct_title_ratings, dim_title, dim_year</w:t>
+            </w:r>
+          </w:p>
+        </w:tc>
+        <w:tc>
+          <w:tcPr>
+            <w:tcW w:w="2647" w:type="dxa"/>
+            <w:vAlign w:val="center"/>
+          </w:tcPr>
+          <w:p>
+            <w:pPr>
+              <w:spacing w:beforeLines="0" w:afterLines="0"/>
+              <w:jc w:val="left"/>
+              <w:rPr>
+                <w:rFonts w:hint="default" w:ascii="Times New Roman" w:hAnsi="Times New Roman" w:eastAsia="Consolas" w:cs="Times New Roman"/>
+                <w:color w:val="auto"/>
+                <w:sz w:val="24"/>
+                <w:szCs w:val="24"/>
+              </w:rPr>
+            </w:pPr>
+            <w:r>
+              <w:rPr>
+                <w:rFonts w:hint="default" w:ascii="Times New Roman" w:hAnsi="Times New Roman" w:eastAsia="Consolas" w:cs="Times New Roman"/>
+                <w:color w:val="auto"/>
+                <w:sz w:val="24"/>
+                <w:szCs w:val="24"/>
+              </w:rPr>
+              <w:t>Analytical mart that aggregates movie count, average runtime, average rating, and runtime-rating correlation by decade. Only movies with valid positive runtimes and non-null ratings are included.</w:t>
+            </w:r>
+          </w:p>
+          <w:p>
+            <w:pPr>
+              <w:widowControl w:val="0"/>
+              <w:spacing w:beforeLines="0" w:afterLines="0"/>
+              <w:jc w:val="center"/>
+              <w:rPr>
+                <w:rFonts w:hint="default" w:ascii="Times New Roman" w:hAnsi="Times New Roman" w:eastAsia="Consolas"/>
+                <w:b w:val="0"/>
+                <w:bCs w:val="0"/>
+                <w:color w:val="auto"/>
+                <w:sz w:val="24"/>
+                <w:szCs w:val="24"/>
+                <w:u w:val="none"/>
+                <w:vertAlign w:val="baseline"/>
+                <w:lang w:val="en-US"/>
+              </w:rPr>
+            </w:pPr>
+          </w:p>
+        </w:tc>
+      </w:tr>
     </w:tbl>
     <w:p>
       <w:pPr>
@@ -9756,10 +10008,10 @@
         </w:tblCellMar>
       </w:tblPr>
       <w:tblGrid>
-        <w:gridCol w:w="3510"/>
-        <w:gridCol w:w="2043"/>
-        <w:gridCol w:w="1880"/>
-        <w:gridCol w:w="2550"/>
+        <w:gridCol w:w="3335"/>
+        <w:gridCol w:w="2669"/>
+        <w:gridCol w:w="1814"/>
+        <w:gridCol w:w="2165"/>
       </w:tblGrid>
       <w:tr>
         <w:tblPrEx>
@@ -11659,6 +11911,195 @@
               </w:rPr>
               <w:t>Validate minimum 5 titles, minimum 1,000 combined votes, rank range 1–10, and uniqueness of director/rank.</w:t>
             </w:r>
+          </w:p>
+        </w:tc>
+        <w:tc>
+          <w:tcPr>
+            <w:tcW w:w="2630" w:type="dxa"/>
+            <w:vAlign w:val="center"/>
+          </w:tcPr>
+          <w:p>
+            <w:pPr>
+              <w:widowControl w:val="0"/>
+              <w:numPr>
+                <w:ilvl w:val="0"/>
+                <w:numId w:val="0"/>
+              </w:numPr>
+              <w:jc w:val="center"/>
+              <w:rPr>
+                <w:rFonts w:hint="default" w:ascii="Times New Roman" w:hAnsi="Times New Roman" w:eastAsia="SimSun"/>
+                <w:b w:val="0"/>
+                <w:bCs w:val="0"/>
+                <w:color w:val="auto"/>
+                <w:sz w:val="24"/>
+                <w:szCs w:val="24"/>
+                <w:u w:val="none"/>
+                <w:vertAlign w:val="baseline"/>
+                <w:lang w:val="en-US"/>
+              </w:rPr>
+            </w:pPr>
+            <w:r>
+              <w:rPr>
+                <w:rFonts w:hint="default" w:ascii="Times New Roman" w:hAnsi="Times New Roman" w:eastAsia="SimSun"/>
+                <w:b w:val="0"/>
+                <w:bCs w:val="0"/>
+                <w:color w:val="auto"/>
+                <w:sz w:val="24"/>
+                <w:szCs w:val="24"/>
+                <w:u w:val="none"/>
+                <w:vertAlign w:val="baseline"/>
+                <w:lang w:val="en-US"/>
+              </w:rPr>
+              <w:t>Error</w:t>
+            </w:r>
+          </w:p>
+        </w:tc>
+      </w:tr>
+      <w:tr>
+        <w:tblPrEx>
+          <w:tblBorders>
+            <w:top w:val="single" w:color="auto" w:sz="4" w:space="0"/>
+            <w:left w:val="single" w:color="auto" w:sz="4" w:space="0"/>
+            <w:bottom w:val="single" w:color="auto" w:sz="4" w:space="0"/>
+            <w:right w:val="single" w:color="auto" w:sz="4" w:space="0"/>
+            <w:insideH w:val="single" w:color="auto" w:sz="4" w:space="0"/>
+            <w:insideV w:val="single" w:color="auto" w:sz="4" w:space="0"/>
+          </w:tblBorders>
+          <w:tblCellMar>
+            <w:top w:w="0" w:type="dxa"/>
+            <w:left w:w="108" w:type="dxa"/>
+            <w:bottom w:w="0" w:type="dxa"/>
+            <w:right w:w="108" w:type="dxa"/>
+          </w:tblCellMar>
+        </w:tblPrEx>
+        <w:tc>
+          <w:tcPr>
+            <w:tcW w:w="3551" w:type="dxa"/>
+            <w:vAlign w:val="center"/>
+          </w:tcPr>
+          <w:p>
+            <w:pPr>
+              <w:widowControl w:val="0"/>
+              <w:numPr>
+                <w:ilvl w:val="0"/>
+                <w:numId w:val="0"/>
+              </w:numPr>
+              <w:jc w:val="center"/>
+              <w:rPr>
+                <w:rFonts w:hint="default" w:ascii="Times New Roman" w:hAnsi="Times New Roman" w:eastAsia="SimSun"/>
+                <w:b/>
+                <w:bCs/>
+                <w:color w:val="auto"/>
+                <w:sz w:val="24"/>
+                <w:szCs w:val="24"/>
+                <w:u w:val="none"/>
+                <w:vertAlign w:val="baseline"/>
+                <w:lang w:val="en-US"/>
+              </w:rPr>
+            </w:pPr>
+            <w:r>
+              <w:rPr>
+                <w:rFonts w:hint="default" w:ascii="Times New Roman" w:hAnsi="Times New Roman" w:eastAsia="SimSun"/>
+                <w:b/>
+                <w:bCs/>
+                <w:color w:val="auto"/>
+                <w:sz w:val="24"/>
+                <w:szCs w:val="24"/>
+                <w:u w:val="none"/>
+                <w:vertAlign w:val="baseline"/>
+                <w:lang w:val="en-US"/>
+              </w:rPr>
+              <w:t>mart_runtime_by_decade tests</w:t>
+            </w:r>
+          </w:p>
+        </w:tc>
+        <w:tc>
+          <w:tcPr>
+            <w:tcW w:w="1908" w:type="dxa"/>
+            <w:vAlign w:val="center"/>
+          </w:tcPr>
+          <w:p>
+            <w:pPr>
+              <w:widowControl w:val="0"/>
+              <w:numPr>
+                <w:ilvl w:val="0"/>
+                <w:numId w:val="0"/>
+              </w:numPr>
+              <w:jc w:val="center"/>
+              <w:rPr>
+                <w:rFonts w:hint="default" w:ascii="Times New Roman" w:hAnsi="Times New Roman" w:eastAsia="SimSun"/>
+                <w:b w:val="0"/>
+                <w:bCs w:val="0"/>
+                <w:color w:val="auto"/>
+                <w:sz w:val="24"/>
+                <w:szCs w:val="24"/>
+                <w:u w:val="single"/>
+                <w:vertAlign w:val="baseline"/>
+                <w:lang w:val="en-US"/>
+              </w:rPr>
+            </w:pPr>
+            <w:r>
+              <w:rPr>
+                <w:rFonts w:hint="default" w:ascii="Times New Roman" w:hAnsi="Times New Roman" w:eastAsia="SimSun"/>
+                <w:b w:val="0"/>
+                <w:bCs w:val="0"/>
+                <w:color w:val="auto"/>
+                <w:sz w:val="24"/>
+                <w:szCs w:val="24"/>
+                <w:u w:val="single"/>
+                <w:vertAlign w:val="baseline"/>
+                <w:lang w:val="en-US"/>
+              </w:rPr>
+              <w:t>mart_runtime_by_decade</w:t>
+            </w:r>
+          </w:p>
+        </w:tc>
+        <w:tc>
+          <w:tcPr>
+            <w:tcW w:w="1894" w:type="dxa"/>
+            <w:vAlign w:val="center"/>
+          </w:tcPr>
+          <w:p>
+            <w:pPr>
+              <w:spacing w:beforeLines="0" w:afterLines="0"/>
+              <w:jc w:val="left"/>
+              <w:rPr>
+                <w:rFonts w:hint="default" w:ascii="Times New Roman" w:hAnsi="Times New Roman" w:eastAsia="Consolas" w:cs="Times New Roman"/>
+                <w:color w:val="auto"/>
+                <w:sz w:val="24"/>
+                <w:szCs w:val="24"/>
+              </w:rPr>
+            </w:pPr>
+            <w:r>
+              <w:rPr>
+                <w:rFonts w:hint="default" w:ascii="Times New Roman" w:hAnsi="Times New Roman" w:eastAsia="Consolas" w:cs="Times New Roman"/>
+                <w:color w:val="auto"/>
+                <w:sz w:val="24"/>
+                <w:szCs w:val="24"/>
+              </w:rPr>
+              <w:t>Validates unique and non-null decades, positive average runtime, average rating within 0–10, and correlation within the valid range [-1, 1].</w:t>
+            </w:r>
+          </w:p>
+          <w:p>
+            <w:pPr>
+              <w:widowControl w:val="0"/>
+              <w:numPr>
+                <w:ilvl w:val="0"/>
+                <w:numId w:val="0"/>
+              </w:numPr>
+              <w:jc w:val="center"/>
+              <w:rPr>
+                <w:rFonts w:hint="default" w:ascii="Times New Roman" w:hAnsi="Times New Roman" w:eastAsia="SimSun"/>
+                <w:b w:val="0"/>
+                <w:bCs w:val="0"/>
+                <w:color w:val="auto"/>
+                <w:sz w:val="24"/>
+                <w:szCs w:val="24"/>
+                <w:u w:val="none"/>
+                <w:vertAlign w:val="baseline"/>
+                <w:lang w:val="en-US"/>
+              </w:rPr>
+            </w:pPr>
           </w:p>
         </w:tc>
         <w:tc>
@@ -12080,6 +12521,10 @@
             <w:insideH w:val="single" w:color="auto" w:sz="4" w:space="0"/>
             <w:insideV w:val="single" w:color="auto" w:sz="4" w:space="0"/>
           </w:tblBorders>
+          <w:tblCellMar>
+            <w:left w:w="108" w:type="dxa"/>
+            <w:right w:w="108" w:type="dxa"/>
+          </w:tblCellMar>
         </w:tblPrEx>
         <w:tc>
           <w:tcPr>
@@ -13742,6 +14187,10 @@
             <w:insideH w:val="single" w:color="auto" w:sz="4" w:space="0"/>
             <w:insideV w:val="single" w:color="auto" w:sz="4" w:space="0"/>
           </w:tblBorders>
+          <w:tblCellMar>
+            <w:left w:w="108" w:type="dxa"/>
+            <w:right w:w="108" w:type="dxa"/>
+          </w:tblCellMar>
         </w:tblPrEx>
         <w:tc>
           <w:tcPr>
@@ -14765,6 +15214,1857 @@
     <w:p>
       <w:pPr>
         <w:numPr>
+          <w:ilvl w:val="1"/>
+          <w:numId w:val="1"/>
+        </w:numPr>
+        <w:ind w:left="840" w:leftChars="0" w:hanging="420" w:firstLineChars="0"/>
+        <w:jc w:val="left"/>
+        <w:rPr>
+          <w:rFonts w:hint="default" w:ascii="Times New Roman" w:hAnsi="Times New Roman" w:eastAsia="SimSun"/>
+          <w:b w:val="0"/>
+          <w:bCs w:val="0"/>
+          <w:color w:val="auto"/>
+          <w:sz w:val="24"/>
+          <w:szCs w:val="24"/>
+          <w:lang w:val="en-US"/>
+        </w:rPr>
+      </w:pPr>
+      <w:r>
+        <w:rPr>
+          <w:rFonts w:hint="default" w:ascii="Times New Roman" w:hAnsi="Times New Roman" w:eastAsia="SimSun"/>
+          <w:b/>
+          <w:bCs/>
+          <w:color w:val="auto"/>
+          <w:sz w:val="24"/>
+          <w:szCs w:val="24"/>
+          <w:lang w:val="en-US"/>
+        </w:rPr>
+        <w:t>Question</w:t>
+      </w:r>
+      <w:r>
+        <w:rPr>
+          <w:rFonts w:hint="default" w:ascii="Times New Roman" w:hAnsi="Times New Roman" w:eastAsia="SimSun"/>
+          <w:b w:val="0"/>
+          <w:bCs w:val="0"/>
+          <w:color w:val="auto"/>
+          <w:sz w:val="24"/>
+          <w:szCs w:val="24"/>
+          <w:lang w:val="en-US"/>
+        </w:rPr>
+        <w:t>: H</w:t>
+      </w:r>
+      <w:r>
+        <w:rPr>
+          <w:rFonts w:hint="default" w:ascii="Times New Roman" w:hAnsi="Times New Roman" w:eastAsia="SimSun" w:cs="Times New Roman"/>
+          <w:sz w:val="24"/>
+          <w:szCs w:val="24"/>
+        </w:rPr>
+        <w:t>as the average movie runtime changed by decade, and does runtime correlate with rating?</w:t>
+      </w:r>
+    </w:p>
+    <w:p>
+      <w:pPr>
+        <w:spacing w:beforeLines="0" w:afterLines="0"/>
+        <w:jc w:val="left"/>
+        <w:rPr>
+          <w:rFonts w:hint="default" w:ascii="Times New Roman" w:hAnsi="Times New Roman" w:eastAsia="Consolas" w:cs="Times New Roman"/>
+          <w:color w:val="auto"/>
+          <w:sz w:val="24"/>
+          <w:szCs w:val="24"/>
+        </w:rPr>
+      </w:pPr>
+      <w:r>
+        <w:rPr>
+          <w:rFonts w:hint="default" w:ascii="Times New Roman" w:hAnsi="Times New Roman" w:eastAsia="SimSun"/>
+          <w:b w:val="0"/>
+          <w:bCs w:val="0"/>
+          <w:color w:val="auto"/>
+          <w:sz w:val="24"/>
+          <w:szCs w:val="24"/>
+          <w:lang w:val="en-US"/>
+        </w:rPr>
+        <w:t xml:space="preserve">       </w:t>
+      </w:r>
+      <w:r>
+        <w:rPr>
+          <w:rFonts w:hint="default" w:ascii="Times New Roman" w:hAnsi="Times New Roman" w:eastAsia="SimSun"/>
+          <w:b/>
+          <w:bCs/>
+          <w:color w:val="auto"/>
+          <w:sz w:val="24"/>
+          <w:szCs w:val="24"/>
+          <w:lang w:val="en-US"/>
+        </w:rPr>
+        <w:t>Model</w:t>
+      </w:r>
+      <w:r>
+        <w:rPr>
+          <w:rFonts w:hint="default" w:ascii="Times New Roman" w:hAnsi="Times New Roman" w:eastAsia="SimSun"/>
+          <w:b w:val="0"/>
+          <w:bCs w:val="0"/>
+          <w:color w:val="auto"/>
+          <w:sz w:val="24"/>
+          <w:szCs w:val="24"/>
+          <w:lang w:val="en-US"/>
+        </w:rPr>
+        <w:t xml:space="preserve">: </w:t>
+      </w:r>
+      <w:r>
+        <w:rPr>
+          <w:rFonts w:hint="default" w:ascii="Times New Roman" w:hAnsi="Times New Roman" w:eastAsia="Consolas" w:cs="Times New Roman"/>
+          <w:color w:val="auto"/>
+          <w:sz w:val="24"/>
+          <w:szCs w:val="24"/>
+          <w:u w:val="single"/>
+        </w:rPr>
+        <w:t>mart_runtime_by_decade</w:t>
+      </w:r>
+      <w:r>
+        <w:rPr>
+          <w:rFonts w:hint="default" w:ascii="Times New Roman" w:hAnsi="Times New Roman" w:eastAsia="Consolas" w:cs="Times New Roman"/>
+          <w:color w:val="auto"/>
+          <w:sz w:val="24"/>
+          <w:szCs w:val="24"/>
+        </w:rPr>
+        <w:t xml:space="preserve"> joins </w:t>
+      </w:r>
+      <w:r>
+        <w:rPr>
+          <w:rFonts w:hint="default" w:ascii="Times New Roman" w:hAnsi="Times New Roman" w:eastAsia="Consolas" w:cs="Times New Roman"/>
+          <w:color w:val="auto"/>
+          <w:sz w:val="24"/>
+          <w:szCs w:val="24"/>
+          <w:u w:val="single"/>
+        </w:rPr>
+        <w:t>fct_title_ratings</w:t>
+      </w:r>
+      <w:r>
+        <w:rPr>
+          <w:rFonts w:hint="default" w:ascii="Times New Roman" w:hAnsi="Times New Roman" w:eastAsia="Consolas" w:cs="Times New Roman"/>
+          <w:color w:val="auto"/>
+          <w:sz w:val="24"/>
+          <w:szCs w:val="24"/>
+        </w:rPr>
+        <w:t xml:space="preserve">, </w:t>
+      </w:r>
+      <w:r>
+        <w:rPr>
+          <w:rFonts w:hint="default" w:ascii="Times New Roman" w:hAnsi="Times New Roman" w:eastAsia="Consolas" w:cs="Times New Roman"/>
+          <w:color w:val="auto"/>
+          <w:sz w:val="24"/>
+          <w:szCs w:val="24"/>
+          <w:u w:val="single"/>
+        </w:rPr>
+        <w:t>dim_title</w:t>
+      </w:r>
+      <w:r>
+        <w:rPr>
+          <w:rFonts w:hint="default" w:ascii="Times New Roman" w:hAnsi="Times New Roman" w:eastAsia="Consolas" w:cs="Times New Roman"/>
+          <w:color w:val="auto"/>
+          <w:sz w:val="24"/>
+          <w:szCs w:val="24"/>
+        </w:rPr>
+        <w:t xml:space="preserve">, and </w:t>
+      </w:r>
+      <w:r>
+        <w:rPr>
+          <w:rFonts w:hint="default" w:ascii="Times New Roman" w:hAnsi="Times New Roman" w:eastAsia="Consolas" w:cs="Times New Roman"/>
+          <w:color w:val="auto"/>
+          <w:sz w:val="24"/>
+          <w:szCs w:val="24"/>
+          <w:u w:val="single"/>
+        </w:rPr>
+        <w:t>dim_year</w:t>
+      </w:r>
+      <w:r>
+        <w:rPr>
+          <w:rFonts w:hint="default" w:ascii="Times New Roman" w:hAnsi="Times New Roman" w:eastAsia="Consolas" w:cs="Times New Roman"/>
+          <w:color w:val="auto"/>
+          <w:sz w:val="24"/>
+          <w:szCs w:val="24"/>
+        </w:rPr>
+        <w:t xml:space="preserve">. It restricts the analysis to </w:t>
+      </w:r>
+      <w:r>
+        <w:rPr>
+          <w:rFonts w:hint="default" w:ascii="Times New Roman" w:hAnsi="Times New Roman" w:eastAsia="Consolas" w:cs="Times New Roman"/>
+          <w:color w:val="auto"/>
+          <w:sz w:val="24"/>
+          <w:szCs w:val="24"/>
+          <w:u w:val="single"/>
+        </w:rPr>
+        <w:t>title_type</w:t>
+      </w:r>
+      <w:r>
+        <w:rPr>
+          <w:rFonts w:hint="default" w:ascii="Times New Roman" w:hAnsi="Times New Roman" w:eastAsia="Consolas" w:cs="Times New Roman"/>
+          <w:color w:val="auto"/>
+          <w:sz w:val="24"/>
+          <w:szCs w:val="24"/>
+        </w:rPr>
+        <w:t xml:space="preserve"> = 'movie', excludes null or non-positive runtimes and null ratings, and aggregates the data by the consistently defined decade from </w:t>
+      </w:r>
+      <w:r>
+        <w:rPr>
+          <w:rFonts w:hint="default" w:ascii="Times New Roman" w:hAnsi="Times New Roman" w:eastAsia="Consolas" w:cs="Times New Roman"/>
+          <w:color w:val="auto"/>
+          <w:sz w:val="24"/>
+          <w:szCs w:val="24"/>
+          <w:u w:val="single"/>
+        </w:rPr>
+        <w:t>dim_year</w:t>
+      </w:r>
+      <w:r>
+        <w:rPr>
+          <w:rFonts w:hint="default" w:ascii="Times New Roman" w:hAnsi="Times New Roman" w:eastAsia="Consolas" w:cs="Times New Roman"/>
+          <w:color w:val="auto"/>
+          <w:sz w:val="24"/>
+          <w:szCs w:val="24"/>
+        </w:rPr>
+        <w:t>. The mart calculates movie count, average runtime, average rating, and Pearson runtime-rating correlation using DuckDB's corr(runtime_minutes, average_rating) function.</w:t>
+      </w:r>
+    </w:p>
+    <w:p>
+      <w:pPr>
+        <w:spacing w:beforeLines="0" w:afterLines="0"/>
+        <w:jc w:val="left"/>
+        <w:rPr>
+          <w:rFonts w:hint="default" w:ascii="Times New Roman" w:hAnsi="Times New Roman" w:eastAsia="Consolas" w:cs="Times New Roman"/>
+          <w:color w:val="auto"/>
+          <w:sz w:val="24"/>
+          <w:szCs w:val="24"/>
+        </w:rPr>
+      </w:pPr>
+    </w:p>
+    <w:p>
+      <w:pPr>
+        <w:numPr>
+          <w:ilvl w:val="0"/>
+          <w:numId w:val="0"/>
+        </w:numPr>
+        <w:ind w:firstLine="720" w:firstLineChars="0"/>
+        <w:jc w:val="left"/>
+        <w:rPr>
+          <w:rFonts w:hint="default" w:ascii="Times New Roman" w:hAnsi="Times New Roman" w:eastAsia="SimSun"/>
+          <w:b w:val="0"/>
+          <w:bCs w:val="0"/>
+          <w:color w:val="auto"/>
+          <w:sz w:val="24"/>
+          <w:szCs w:val="24"/>
+          <w:lang w:val="en-US"/>
+        </w:rPr>
+      </w:pPr>
+      <w:r>
+        <w:rPr>
+          <w:rFonts w:hint="default" w:ascii="Times New Roman" w:hAnsi="Times New Roman" w:eastAsia="SimSun"/>
+          <w:b w:val="0"/>
+          <w:bCs w:val="0"/>
+          <w:color w:val="auto"/>
+          <w:sz w:val="24"/>
+          <w:szCs w:val="24"/>
+          <w:lang w:val="en-US"/>
+        </w:rPr>
+        <w:t xml:space="preserve"> </w:t>
+      </w:r>
+      <w:r>
+        <w:rPr>
+          <w:rFonts w:hint="default" w:ascii="Times New Roman" w:hAnsi="Times New Roman" w:eastAsia="SimSun"/>
+          <w:b/>
+          <w:bCs/>
+          <w:color w:val="auto"/>
+          <w:sz w:val="24"/>
+          <w:szCs w:val="24"/>
+          <w:lang w:val="en-US"/>
+        </w:rPr>
+        <w:t>Result</w:t>
+      </w:r>
+      <w:r>
+        <w:rPr>
+          <w:rFonts w:hint="default" w:ascii="Times New Roman" w:hAnsi="Times New Roman" w:eastAsia="SimSun"/>
+          <w:b w:val="0"/>
+          <w:bCs w:val="0"/>
+          <w:color w:val="auto"/>
+          <w:sz w:val="24"/>
+          <w:szCs w:val="24"/>
+          <w:lang w:val="en-US"/>
+        </w:rPr>
+        <w:t>:</w:t>
+      </w:r>
+    </w:p>
+    <w:p>
+      <w:pPr>
+        <w:numPr>
+          <w:ilvl w:val="0"/>
+          <w:numId w:val="0"/>
+        </w:numPr>
+        <w:ind w:firstLine="720" w:firstLineChars="0"/>
+        <w:jc w:val="left"/>
+        <w:rPr>
+          <w:rFonts w:hint="default" w:ascii="Times New Roman" w:hAnsi="Times New Roman" w:eastAsia="SimSun"/>
+          <w:b w:val="0"/>
+          <w:bCs w:val="0"/>
+          <w:color w:val="auto"/>
+          <w:sz w:val="24"/>
+          <w:szCs w:val="24"/>
+          <w:lang w:val="en-US"/>
+        </w:rPr>
+      </w:pPr>
+    </w:p>
+    <w:tbl>
+      <w:tblPr>
+        <w:tblStyle w:val="9"/>
+        <w:tblW w:w="0" w:type="auto"/>
+        <w:tblInd w:w="0" w:type="dxa"/>
+        <w:tblBorders>
+          <w:top w:val="single" w:color="auto" w:sz="4" w:space="0"/>
+          <w:left w:val="single" w:color="auto" w:sz="4" w:space="0"/>
+          <w:bottom w:val="single" w:color="auto" w:sz="4" w:space="0"/>
+          <w:right w:val="single" w:color="auto" w:sz="4" w:space="0"/>
+          <w:insideH w:val="single" w:color="auto" w:sz="4" w:space="0"/>
+          <w:insideV w:val="single" w:color="auto" w:sz="4" w:space="0"/>
+        </w:tblBorders>
+        <w:tblLayout w:type="autofit"/>
+        <w:tblCellMar>
+          <w:left w:w="108" w:type="dxa"/>
+          <w:right w:w="108" w:type="dxa"/>
+        </w:tblCellMar>
+      </w:tblPr>
+      <w:tblGrid>
+        <w:gridCol w:w="1704"/>
+        <w:gridCol w:w="1704"/>
+        <w:gridCol w:w="1704"/>
+        <w:gridCol w:w="1705"/>
+        <w:gridCol w:w="1705"/>
+      </w:tblGrid>
+      <w:tr>
+        <w:tblPrEx>
+          <w:tblBorders>
+            <w:top w:val="single" w:color="auto" w:sz="4" w:space="0"/>
+            <w:left w:val="single" w:color="auto" w:sz="4" w:space="0"/>
+            <w:bottom w:val="single" w:color="auto" w:sz="4" w:space="0"/>
+            <w:right w:val="single" w:color="auto" w:sz="4" w:space="0"/>
+            <w:insideH w:val="single" w:color="auto" w:sz="4" w:space="0"/>
+            <w:insideV w:val="single" w:color="auto" w:sz="4" w:space="0"/>
+          </w:tblBorders>
+          <w:tblCellMar>
+            <w:left w:w="108" w:type="dxa"/>
+            <w:right w:w="108" w:type="dxa"/>
+          </w:tblCellMar>
+        </w:tblPrEx>
+        <w:tc>
+          <w:tcPr>
+            <w:tcW w:w="1704" w:type="dxa"/>
+            <w:vAlign w:val="center"/>
+          </w:tcPr>
+          <w:p>
+            <w:pPr>
+              <w:numPr>
+                <w:ilvl w:val="0"/>
+                <w:numId w:val="0"/>
+              </w:numPr>
+              <w:jc w:val="center"/>
+              <w:rPr>
+                <w:rFonts w:hint="default" w:ascii="Times New Roman" w:hAnsi="Times New Roman" w:eastAsia="SimSun"/>
+                <w:b/>
+                <w:bCs/>
+                <w:color w:val="auto"/>
+                <w:sz w:val="24"/>
+                <w:szCs w:val="24"/>
+                <w:vertAlign w:val="baseline"/>
+                <w:lang w:val="en-US"/>
+              </w:rPr>
+            </w:pPr>
+            <w:r>
+              <w:rPr>
+                <w:rFonts w:hint="default" w:ascii="Times New Roman" w:hAnsi="Times New Roman" w:eastAsia="SimSun"/>
+                <w:b/>
+                <w:bCs/>
+                <w:color w:val="auto"/>
+                <w:sz w:val="24"/>
+                <w:szCs w:val="24"/>
+                <w:vertAlign w:val="baseline"/>
+                <w:lang w:val="en-US"/>
+              </w:rPr>
+              <w:t>Decade</w:t>
+            </w:r>
+          </w:p>
+        </w:tc>
+        <w:tc>
+          <w:tcPr>
+            <w:tcW w:w="1704" w:type="dxa"/>
+            <w:vAlign w:val="center"/>
+          </w:tcPr>
+          <w:p>
+            <w:pPr>
+              <w:numPr>
+                <w:ilvl w:val="0"/>
+                <w:numId w:val="0"/>
+              </w:numPr>
+              <w:jc w:val="center"/>
+              <w:rPr>
+                <w:rFonts w:hint="default" w:ascii="Times New Roman" w:hAnsi="Times New Roman" w:eastAsia="SimSun"/>
+                <w:b/>
+                <w:bCs/>
+                <w:color w:val="auto"/>
+                <w:sz w:val="24"/>
+                <w:szCs w:val="24"/>
+                <w:vertAlign w:val="baseline"/>
+                <w:lang w:val="en-US"/>
+              </w:rPr>
+            </w:pPr>
+            <w:r>
+              <w:rPr>
+                <w:rFonts w:hint="default" w:ascii="Times New Roman" w:hAnsi="Times New Roman" w:eastAsia="SimSun"/>
+                <w:b/>
+                <w:bCs/>
+                <w:color w:val="auto"/>
+                <w:sz w:val="24"/>
+                <w:szCs w:val="24"/>
+                <w:vertAlign w:val="baseline"/>
+                <w:lang w:val="en-US"/>
+              </w:rPr>
+              <w:t>Movie count</w:t>
+            </w:r>
+          </w:p>
+        </w:tc>
+        <w:tc>
+          <w:tcPr>
+            <w:tcW w:w="1704" w:type="dxa"/>
+            <w:vAlign w:val="center"/>
+          </w:tcPr>
+          <w:p>
+            <w:pPr>
+              <w:numPr>
+                <w:ilvl w:val="0"/>
+                <w:numId w:val="0"/>
+              </w:numPr>
+              <w:jc w:val="center"/>
+              <w:rPr>
+                <w:rFonts w:hint="default" w:ascii="Times New Roman" w:hAnsi="Times New Roman" w:eastAsia="SimSun"/>
+                <w:b/>
+                <w:bCs/>
+                <w:color w:val="auto"/>
+                <w:sz w:val="24"/>
+                <w:szCs w:val="24"/>
+                <w:vertAlign w:val="baseline"/>
+                <w:lang w:val="en-US"/>
+              </w:rPr>
+            </w:pPr>
+            <w:r>
+              <w:rPr>
+                <w:rFonts w:hint="default" w:ascii="Times New Roman" w:hAnsi="Times New Roman" w:eastAsia="SimSun"/>
+                <w:b/>
+                <w:bCs/>
+                <w:color w:val="auto"/>
+                <w:sz w:val="24"/>
+                <w:szCs w:val="24"/>
+                <w:vertAlign w:val="baseline"/>
+                <w:lang w:val="en-US"/>
+              </w:rPr>
+              <w:t>Average runtime</w:t>
+            </w:r>
+          </w:p>
+        </w:tc>
+        <w:tc>
+          <w:tcPr>
+            <w:tcW w:w="1705" w:type="dxa"/>
+            <w:vAlign w:val="center"/>
+          </w:tcPr>
+          <w:p>
+            <w:pPr>
+              <w:numPr>
+                <w:ilvl w:val="0"/>
+                <w:numId w:val="0"/>
+              </w:numPr>
+              <w:jc w:val="center"/>
+              <w:rPr>
+                <w:rFonts w:hint="default" w:ascii="Times New Roman" w:hAnsi="Times New Roman" w:eastAsia="SimSun"/>
+                <w:b/>
+                <w:bCs/>
+                <w:color w:val="auto"/>
+                <w:sz w:val="24"/>
+                <w:szCs w:val="24"/>
+                <w:vertAlign w:val="baseline"/>
+                <w:lang w:val="en-US"/>
+              </w:rPr>
+            </w:pPr>
+            <w:r>
+              <w:rPr>
+                <w:rFonts w:hint="default" w:ascii="Times New Roman" w:hAnsi="Times New Roman" w:eastAsia="SimSun"/>
+                <w:b/>
+                <w:bCs/>
+                <w:color w:val="auto"/>
+                <w:sz w:val="24"/>
+                <w:szCs w:val="24"/>
+                <w:vertAlign w:val="baseline"/>
+                <w:lang w:val="en-US"/>
+              </w:rPr>
+              <w:t>Average rating</w:t>
+            </w:r>
+          </w:p>
+        </w:tc>
+        <w:tc>
+          <w:tcPr>
+            <w:tcW w:w="1705" w:type="dxa"/>
+            <w:vAlign w:val="center"/>
+          </w:tcPr>
+          <w:p>
+            <w:pPr>
+              <w:numPr>
+                <w:ilvl w:val="0"/>
+                <w:numId w:val="0"/>
+              </w:numPr>
+              <w:jc w:val="center"/>
+              <w:rPr>
+                <w:rFonts w:hint="default" w:ascii="Times New Roman" w:hAnsi="Times New Roman" w:eastAsia="SimSun"/>
+                <w:b/>
+                <w:bCs/>
+                <w:color w:val="auto"/>
+                <w:sz w:val="24"/>
+                <w:szCs w:val="24"/>
+                <w:vertAlign w:val="baseline"/>
+                <w:lang w:val="en-US"/>
+              </w:rPr>
+            </w:pPr>
+            <w:r>
+              <w:rPr>
+                <w:rFonts w:hint="default" w:ascii="Times New Roman" w:hAnsi="Times New Roman" w:eastAsia="SimSun"/>
+                <w:b/>
+                <w:bCs/>
+                <w:color w:val="auto"/>
+                <w:sz w:val="24"/>
+                <w:szCs w:val="24"/>
+                <w:vertAlign w:val="baseline"/>
+                <w:lang w:val="en-US"/>
+              </w:rPr>
+              <w:t>Runtime-rating correlation</w:t>
+            </w:r>
+          </w:p>
+        </w:tc>
+      </w:tr>
+      <w:tr>
+        <w:tblPrEx>
+          <w:tblBorders>
+            <w:top w:val="single" w:color="auto" w:sz="4" w:space="0"/>
+            <w:left w:val="single" w:color="auto" w:sz="4" w:space="0"/>
+            <w:bottom w:val="single" w:color="auto" w:sz="4" w:space="0"/>
+            <w:right w:val="single" w:color="auto" w:sz="4" w:space="0"/>
+            <w:insideH w:val="single" w:color="auto" w:sz="4" w:space="0"/>
+            <w:insideV w:val="single" w:color="auto" w:sz="4" w:space="0"/>
+          </w:tblBorders>
+          <w:tblCellMar>
+            <w:left w:w="108" w:type="dxa"/>
+            <w:right w:w="108" w:type="dxa"/>
+          </w:tblCellMar>
+        </w:tblPrEx>
+        <w:tc>
+          <w:tcPr>
+            <w:tcW w:w="1704" w:type="dxa"/>
+            <w:vAlign w:val="center"/>
+          </w:tcPr>
+          <w:p>
+            <w:pPr>
+              <w:numPr>
+                <w:ilvl w:val="0"/>
+                <w:numId w:val="0"/>
+              </w:numPr>
+              <w:jc w:val="center"/>
+              <w:rPr>
+                <w:rFonts w:hint="default" w:ascii="Times New Roman" w:hAnsi="Times New Roman" w:eastAsia="SimSun"/>
+                <w:b w:val="0"/>
+                <w:bCs w:val="0"/>
+                <w:color w:val="auto"/>
+                <w:sz w:val="24"/>
+                <w:szCs w:val="24"/>
+                <w:vertAlign w:val="baseline"/>
+                <w:lang w:val="en-US"/>
+              </w:rPr>
+            </w:pPr>
+            <w:r>
+              <w:rPr>
+                <w:rFonts w:hint="default" w:ascii="Times New Roman" w:hAnsi="Times New Roman" w:eastAsia="SimSun"/>
+                <w:b w:val="0"/>
+                <w:bCs w:val="0"/>
+                <w:color w:val="auto"/>
+                <w:sz w:val="24"/>
+                <w:szCs w:val="24"/>
+                <w:vertAlign w:val="baseline"/>
+                <w:lang w:val="en-US"/>
+              </w:rPr>
+              <w:t>1920</w:t>
+            </w:r>
+          </w:p>
+        </w:tc>
+        <w:tc>
+          <w:tcPr>
+            <w:tcW w:w="1704" w:type="dxa"/>
+            <w:vAlign w:val="center"/>
+          </w:tcPr>
+          <w:p>
+            <w:pPr>
+              <w:numPr>
+                <w:ilvl w:val="0"/>
+                <w:numId w:val="0"/>
+              </w:numPr>
+              <w:jc w:val="center"/>
+              <w:rPr>
+                <w:rFonts w:hint="default" w:ascii="Times New Roman" w:hAnsi="Times New Roman" w:eastAsia="SimSun"/>
+                <w:b w:val="0"/>
+                <w:bCs w:val="0"/>
+                <w:color w:val="auto"/>
+                <w:sz w:val="24"/>
+                <w:szCs w:val="24"/>
+                <w:vertAlign w:val="baseline"/>
+                <w:lang w:val="en-US"/>
+              </w:rPr>
+            </w:pPr>
+            <w:r>
+              <w:rPr>
+                <w:rFonts w:hint="default" w:ascii="Times New Roman" w:hAnsi="Times New Roman" w:eastAsia="SimSun"/>
+                <w:b w:val="0"/>
+                <w:bCs w:val="0"/>
+                <w:color w:val="auto"/>
+                <w:sz w:val="24"/>
+                <w:szCs w:val="24"/>
+                <w:vertAlign w:val="baseline"/>
+                <w:lang w:val="en-US"/>
+              </w:rPr>
+              <w:t>3523</w:t>
+            </w:r>
+          </w:p>
+        </w:tc>
+        <w:tc>
+          <w:tcPr>
+            <w:tcW w:w="1704" w:type="dxa"/>
+            <w:vAlign w:val="center"/>
+          </w:tcPr>
+          <w:p>
+            <w:pPr>
+              <w:numPr>
+                <w:ilvl w:val="0"/>
+                <w:numId w:val="0"/>
+              </w:numPr>
+              <w:jc w:val="center"/>
+              <w:rPr>
+                <w:rFonts w:hint="default" w:ascii="Times New Roman" w:hAnsi="Times New Roman" w:eastAsia="SimSun"/>
+                <w:b w:val="0"/>
+                <w:bCs w:val="0"/>
+                <w:color w:val="auto"/>
+                <w:sz w:val="24"/>
+                <w:szCs w:val="24"/>
+                <w:vertAlign w:val="baseline"/>
+                <w:lang w:val="en-US"/>
+              </w:rPr>
+            </w:pPr>
+            <w:r>
+              <w:rPr>
+                <w:rFonts w:hint="default" w:ascii="Times New Roman" w:hAnsi="Times New Roman" w:eastAsia="SimSun"/>
+                <w:b w:val="0"/>
+                <w:bCs w:val="0"/>
+                <w:color w:val="auto"/>
+                <w:sz w:val="24"/>
+                <w:szCs w:val="24"/>
+                <w:vertAlign w:val="baseline"/>
+                <w:lang w:val="en-US"/>
+              </w:rPr>
+              <w:t>80.38 min</w:t>
+            </w:r>
+          </w:p>
+        </w:tc>
+        <w:tc>
+          <w:tcPr>
+            <w:tcW w:w="1705" w:type="dxa"/>
+            <w:vAlign w:val="center"/>
+          </w:tcPr>
+          <w:p>
+            <w:pPr>
+              <w:numPr>
+                <w:ilvl w:val="0"/>
+                <w:numId w:val="0"/>
+              </w:numPr>
+              <w:jc w:val="center"/>
+              <w:rPr>
+                <w:rFonts w:hint="default" w:ascii="Times New Roman" w:hAnsi="Times New Roman" w:eastAsia="SimSun"/>
+                <w:b w:val="0"/>
+                <w:bCs w:val="0"/>
+                <w:color w:val="auto"/>
+                <w:sz w:val="24"/>
+                <w:szCs w:val="24"/>
+                <w:vertAlign w:val="baseline"/>
+                <w:lang w:val="en-US"/>
+              </w:rPr>
+            </w:pPr>
+            <w:r>
+              <w:rPr>
+                <w:rFonts w:hint="default" w:ascii="Times New Roman" w:hAnsi="Times New Roman" w:eastAsia="SimSun"/>
+                <w:b w:val="0"/>
+                <w:bCs w:val="0"/>
+                <w:color w:val="auto"/>
+                <w:sz w:val="24"/>
+                <w:szCs w:val="24"/>
+                <w:vertAlign w:val="baseline"/>
+                <w:lang w:val="en-US"/>
+              </w:rPr>
+              <w:t>5.91</w:t>
+            </w:r>
+          </w:p>
+        </w:tc>
+        <w:tc>
+          <w:tcPr>
+            <w:tcW w:w="1705" w:type="dxa"/>
+            <w:vAlign w:val="center"/>
+          </w:tcPr>
+          <w:p>
+            <w:pPr>
+              <w:numPr>
+                <w:ilvl w:val="0"/>
+                <w:numId w:val="0"/>
+              </w:numPr>
+              <w:jc w:val="center"/>
+              <w:rPr>
+                <w:rFonts w:hint="default" w:ascii="Times New Roman" w:hAnsi="Times New Roman" w:eastAsia="SimSun"/>
+                <w:b w:val="0"/>
+                <w:bCs w:val="0"/>
+                <w:color w:val="auto"/>
+                <w:sz w:val="24"/>
+                <w:szCs w:val="24"/>
+                <w:vertAlign w:val="baseline"/>
+                <w:lang w:val="en-US"/>
+              </w:rPr>
+            </w:pPr>
+            <w:r>
+              <w:rPr>
+                <w:rFonts w:hint="default" w:ascii="Times New Roman" w:hAnsi="Times New Roman" w:eastAsia="SimSun"/>
+                <w:b w:val="0"/>
+                <w:bCs w:val="0"/>
+                <w:color w:val="auto"/>
+                <w:sz w:val="24"/>
+                <w:szCs w:val="24"/>
+                <w:vertAlign w:val="baseline"/>
+                <w:lang w:val="en-US"/>
+              </w:rPr>
+              <w:t>0.114</w:t>
+            </w:r>
+          </w:p>
+        </w:tc>
+      </w:tr>
+      <w:tr>
+        <w:tblPrEx>
+          <w:tblBorders>
+            <w:top w:val="single" w:color="auto" w:sz="4" w:space="0"/>
+            <w:left w:val="single" w:color="auto" w:sz="4" w:space="0"/>
+            <w:bottom w:val="single" w:color="auto" w:sz="4" w:space="0"/>
+            <w:right w:val="single" w:color="auto" w:sz="4" w:space="0"/>
+            <w:insideH w:val="single" w:color="auto" w:sz="4" w:space="0"/>
+            <w:insideV w:val="single" w:color="auto" w:sz="4" w:space="0"/>
+          </w:tblBorders>
+          <w:tblCellMar>
+            <w:left w:w="108" w:type="dxa"/>
+            <w:right w:w="108" w:type="dxa"/>
+          </w:tblCellMar>
+        </w:tblPrEx>
+        <w:tc>
+          <w:tcPr>
+            <w:tcW w:w="1704" w:type="dxa"/>
+            <w:vAlign w:val="center"/>
+          </w:tcPr>
+          <w:p>
+            <w:pPr>
+              <w:numPr>
+                <w:ilvl w:val="0"/>
+                <w:numId w:val="0"/>
+              </w:numPr>
+              <w:jc w:val="center"/>
+              <w:rPr>
+                <w:rFonts w:hint="default" w:ascii="Times New Roman" w:hAnsi="Times New Roman" w:eastAsia="SimSun"/>
+                <w:b w:val="0"/>
+                <w:bCs w:val="0"/>
+                <w:color w:val="auto"/>
+                <w:sz w:val="24"/>
+                <w:szCs w:val="24"/>
+                <w:vertAlign w:val="baseline"/>
+                <w:lang w:val="en-US"/>
+              </w:rPr>
+            </w:pPr>
+            <w:r>
+              <w:rPr>
+                <w:rFonts w:hint="default" w:ascii="Times New Roman" w:hAnsi="Times New Roman" w:eastAsia="SimSun"/>
+                <w:b w:val="0"/>
+                <w:bCs w:val="0"/>
+                <w:color w:val="auto"/>
+                <w:sz w:val="24"/>
+                <w:szCs w:val="24"/>
+                <w:vertAlign w:val="baseline"/>
+                <w:lang w:val="en-US"/>
+              </w:rPr>
+              <w:t>1950</w:t>
+            </w:r>
+          </w:p>
+        </w:tc>
+        <w:tc>
+          <w:tcPr>
+            <w:tcW w:w="1704" w:type="dxa"/>
+            <w:vAlign w:val="center"/>
+          </w:tcPr>
+          <w:p>
+            <w:pPr>
+              <w:numPr>
+                <w:ilvl w:val="0"/>
+                <w:numId w:val="0"/>
+              </w:numPr>
+              <w:jc w:val="center"/>
+              <w:rPr>
+                <w:rFonts w:hint="default" w:ascii="Times New Roman" w:hAnsi="Times New Roman" w:eastAsia="SimSun"/>
+                <w:b w:val="0"/>
+                <w:bCs w:val="0"/>
+                <w:color w:val="auto"/>
+                <w:sz w:val="24"/>
+                <w:szCs w:val="24"/>
+                <w:vertAlign w:val="baseline"/>
+                <w:lang w:val="en-US"/>
+              </w:rPr>
+            </w:pPr>
+            <w:r>
+              <w:rPr>
+                <w:rFonts w:hint="default" w:ascii="Times New Roman" w:hAnsi="Times New Roman" w:eastAsia="SimSun"/>
+                <w:b w:val="0"/>
+                <w:bCs w:val="0"/>
+                <w:color w:val="auto"/>
+                <w:sz w:val="24"/>
+                <w:szCs w:val="24"/>
+                <w:vertAlign w:val="baseline"/>
+                <w:lang w:val="en-US"/>
+              </w:rPr>
+              <w:t>12292</w:t>
+            </w:r>
+          </w:p>
+        </w:tc>
+        <w:tc>
+          <w:tcPr>
+            <w:tcW w:w="1704" w:type="dxa"/>
+            <w:vAlign w:val="center"/>
+          </w:tcPr>
+          <w:p>
+            <w:pPr>
+              <w:numPr>
+                <w:ilvl w:val="0"/>
+                <w:numId w:val="0"/>
+              </w:numPr>
+              <w:jc w:val="center"/>
+              <w:rPr>
+                <w:rFonts w:hint="default" w:ascii="Times New Roman" w:hAnsi="Times New Roman" w:eastAsia="SimSun"/>
+                <w:b w:val="0"/>
+                <w:bCs w:val="0"/>
+                <w:color w:val="auto"/>
+                <w:sz w:val="24"/>
+                <w:szCs w:val="24"/>
+                <w:vertAlign w:val="baseline"/>
+                <w:lang w:val="en-US"/>
+              </w:rPr>
+            </w:pPr>
+            <w:r>
+              <w:rPr>
+                <w:rFonts w:hint="default" w:ascii="Times New Roman" w:hAnsi="Times New Roman" w:eastAsia="SimSun"/>
+                <w:b w:val="0"/>
+                <w:bCs w:val="0"/>
+                <w:color w:val="auto"/>
+                <w:sz w:val="24"/>
+                <w:szCs w:val="24"/>
+                <w:vertAlign w:val="baseline"/>
+                <w:lang w:val="en-US"/>
+              </w:rPr>
+              <w:t>92.50 min</w:t>
+            </w:r>
+          </w:p>
+        </w:tc>
+        <w:tc>
+          <w:tcPr>
+            <w:tcW w:w="1705" w:type="dxa"/>
+            <w:vAlign w:val="center"/>
+          </w:tcPr>
+          <w:p>
+            <w:pPr>
+              <w:numPr>
+                <w:ilvl w:val="0"/>
+                <w:numId w:val="0"/>
+              </w:numPr>
+              <w:jc w:val="center"/>
+              <w:rPr>
+                <w:rFonts w:hint="default" w:ascii="Times New Roman" w:hAnsi="Times New Roman" w:eastAsia="SimSun"/>
+                <w:b w:val="0"/>
+                <w:bCs w:val="0"/>
+                <w:color w:val="auto"/>
+                <w:sz w:val="24"/>
+                <w:szCs w:val="24"/>
+                <w:vertAlign w:val="baseline"/>
+                <w:lang w:val="en-US"/>
+              </w:rPr>
+            </w:pPr>
+            <w:r>
+              <w:rPr>
+                <w:rFonts w:hint="default" w:ascii="Times New Roman" w:hAnsi="Times New Roman" w:eastAsia="SimSun"/>
+                <w:b w:val="0"/>
+                <w:bCs w:val="0"/>
+                <w:color w:val="auto"/>
+                <w:sz w:val="24"/>
+                <w:szCs w:val="24"/>
+                <w:vertAlign w:val="baseline"/>
+                <w:lang w:val="en-US"/>
+              </w:rPr>
+              <w:t>6.13</w:t>
+            </w:r>
+          </w:p>
+        </w:tc>
+        <w:tc>
+          <w:tcPr>
+            <w:tcW w:w="1705" w:type="dxa"/>
+            <w:vAlign w:val="center"/>
+          </w:tcPr>
+          <w:p>
+            <w:pPr>
+              <w:numPr>
+                <w:ilvl w:val="0"/>
+                <w:numId w:val="0"/>
+              </w:numPr>
+              <w:jc w:val="center"/>
+              <w:rPr>
+                <w:rFonts w:hint="default" w:ascii="Times New Roman" w:hAnsi="Times New Roman" w:eastAsia="SimSun"/>
+                <w:b w:val="0"/>
+                <w:bCs w:val="0"/>
+                <w:color w:val="auto"/>
+                <w:sz w:val="24"/>
+                <w:szCs w:val="24"/>
+                <w:vertAlign w:val="baseline"/>
+                <w:lang w:val="en-US"/>
+              </w:rPr>
+            </w:pPr>
+            <w:r>
+              <w:rPr>
+                <w:rFonts w:hint="default" w:ascii="Times New Roman" w:hAnsi="Times New Roman" w:eastAsia="SimSun"/>
+                <w:b w:val="0"/>
+                <w:bCs w:val="0"/>
+                <w:color w:val="auto"/>
+                <w:sz w:val="24"/>
+                <w:szCs w:val="24"/>
+                <w:vertAlign w:val="baseline"/>
+                <w:lang w:val="en-US"/>
+              </w:rPr>
+              <w:t>0.253</w:t>
+            </w:r>
+          </w:p>
+        </w:tc>
+      </w:tr>
+      <w:tr>
+        <w:tblPrEx>
+          <w:tblBorders>
+            <w:top w:val="single" w:color="auto" w:sz="4" w:space="0"/>
+            <w:left w:val="single" w:color="auto" w:sz="4" w:space="0"/>
+            <w:bottom w:val="single" w:color="auto" w:sz="4" w:space="0"/>
+            <w:right w:val="single" w:color="auto" w:sz="4" w:space="0"/>
+            <w:insideH w:val="single" w:color="auto" w:sz="4" w:space="0"/>
+            <w:insideV w:val="single" w:color="auto" w:sz="4" w:space="0"/>
+          </w:tblBorders>
+          <w:tblCellMar>
+            <w:left w:w="108" w:type="dxa"/>
+            <w:right w:w="108" w:type="dxa"/>
+          </w:tblCellMar>
+        </w:tblPrEx>
+        <w:tc>
+          <w:tcPr>
+            <w:tcW w:w="1704" w:type="dxa"/>
+            <w:vAlign w:val="center"/>
+          </w:tcPr>
+          <w:p>
+            <w:pPr>
+              <w:numPr>
+                <w:ilvl w:val="0"/>
+                <w:numId w:val="0"/>
+              </w:numPr>
+              <w:jc w:val="center"/>
+              <w:rPr>
+                <w:rFonts w:hint="default" w:ascii="Times New Roman" w:hAnsi="Times New Roman" w:eastAsia="SimSun"/>
+                <w:b w:val="0"/>
+                <w:bCs w:val="0"/>
+                <w:color w:val="auto"/>
+                <w:sz w:val="24"/>
+                <w:szCs w:val="24"/>
+                <w:vertAlign w:val="baseline"/>
+                <w:lang w:val="en-US"/>
+              </w:rPr>
+            </w:pPr>
+            <w:r>
+              <w:rPr>
+                <w:rFonts w:hint="default" w:ascii="Times New Roman" w:hAnsi="Times New Roman" w:eastAsia="SimSun"/>
+                <w:b w:val="0"/>
+                <w:bCs w:val="0"/>
+                <w:color w:val="auto"/>
+                <w:sz w:val="24"/>
+                <w:szCs w:val="24"/>
+                <w:vertAlign w:val="baseline"/>
+                <w:lang w:val="en-US"/>
+              </w:rPr>
+              <w:t>1970</w:t>
+            </w:r>
+          </w:p>
+        </w:tc>
+        <w:tc>
+          <w:tcPr>
+            <w:tcW w:w="1704" w:type="dxa"/>
+            <w:vAlign w:val="center"/>
+          </w:tcPr>
+          <w:p>
+            <w:pPr>
+              <w:numPr>
+                <w:ilvl w:val="0"/>
+                <w:numId w:val="0"/>
+              </w:numPr>
+              <w:jc w:val="center"/>
+              <w:rPr>
+                <w:rFonts w:hint="default" w:ascii="Times New Roman" w:hAnsi="Times New Roman" w:eastAsia="SimSun"/>
+                <w:b w:val="0"/>
+                <w:bCs w:val="0"/>
+                <w:color w:val="auto"/>
+                <w:sz w:val="24"/>
+                <w:szCs w:val="24"/>
+                <w:vertAlign w:val="baseline"/>
+                <w:lang w:val="en-US"/>
+              </w:rPr>
+            </w:pPr>
+            <w:r>
+              <w:rPr>
+                <w:rFonts w:hint="default" w:ascii="Times New Roman" w:hAnsi="Times New Roman" w:eastAsia="SimSun"/>
+                <w:b w:val="0"/>
+                <w:bCs w:val="0"/>
+                <w:color w:val="auto"/>
+                <w:sz w:val="24"/>
+                <w:szCs w:val="24"/>
+                <w:vertAlign w:val="baseline"/>
+                <w:lang w:val="en-US"/>
+              </w:rPr>
+              <w:t>21749</w:t>
+            </w:r>
+          </w:p>
+        </w:tc>
+        <w:tc>
+          <w:tcPr>
+            <w:tcW w:w="1704" w:type="dxa"/>
+            <w:vAlign w:val="center"/>
+          </w:tcPr>
+          <w:p>
+            <w:pPr>
+              <w:numPr>
+                <w:ilvl w:val="0"/>
+                <w:numId w:val="0"/>
+              </w:numPr>
+              <w:jc w:val="center"/>
+              <w:rPr>
+                <w:rFonts w:hint="default" w:ascii="Times New Roman" w:hAnsi="Times New Roman" w:eastAsia="SimSun"/>
+                <w:b w:val="0"/>
+                <w:bCs w:val="0"/>
+                <w:color w:val="auto"/>
+                <w:sz w:val="24"/>
+                <w:szCs w:val="24"/>
+                <w:vertAlign w:val="baseline"/>
+                <w:lang w:val="en-US"/>
+              </w:rPr>
+            </w:pPr>
+            <w:r>
+              <w:rPr>
+                <w:rFonts w:hint="default" w:ascii="Times New Roman" w:hAnsi="Times New Roman" w:eastAsia="SimSun"/>
+                <w:b w:val="0"/>
+                <w:bCs w:val="0"/>
+                <w:color w:val="auto"/>
+                <w:sz w:val="24"/>
+                <w:szCs w:val="24"/>
+                <w:vertAlign w:val="baseline"/>
+                <w:lang w:val="en-US"/>
+              </w:rPr>
+              <w:t>94.03 min</w:t>
+            </w:r>
+          </w:p>
+        </w:tc>
+        <w:tc>
+          <w:tcPr>
+            <w:tcW w:w="1705" w:type="dxa"/>
+            <w:vAlign w:val="center"/>
+          </w:tcPr>
+          <w:p>
+            <w:pPr>
+              <w:numPr>
+                <w:ilvl w:val="0"/>
+                <w:numId w:val="0"/>
+              </w:numPr>
+              <w:jc w:val="center"/>
+              <w:rPr>
+                <w:rFonts w:hint="default" w:ascii="Times New Roman" w:hAnsi="Times New Roman" w:eastAsia="SimSun"/>
+                <w:b w:val="0"/>
+                <w:bCs w:val="0"/>
+                <w:color w:val="auto"/>
+                <w:sz w:val="24"/>
+                <w:szCs w:val="24"/>
+                <w:vertAlign w:val="baseline"/>
+                <w:lang w:val="en-US"/>
+              </w:rPr>
+            </w:pPr>
+            <w:r>
+              <w:rPr>
+                <w:rFonts w:hint="default" w:ascii="Times New Roman" w:hAnsi="Times New Roman" w:eastAsia="SimSun"/>
+                <w:b w:val="0"/>
+                <w:bCs w:val="0"/>
+                <w:color w:val="auto"/>
+                <w:sz w:val="24"/>
+                <w:szCs w:val="24"/>
+                <w:vertAlign w:val="baseline"/>
+                <w:lang w:val="en-US"/>
+              </w:rPr>
+              <w:t>5.89</w:t>
+            </w:r>
+          </w:p>
+        </w:tc>
+        <w:tc>
+          <w:tcPr>
+            <w:tcW w:w="1705" w:type="dxa"/>
+            <w:vAlign w:val="center"/>
+          </w:tcPr>
+          <w:p>
+            <w:pPr>
+              <w:numPr>
+                <w:ilvl w:val="0"/>
+                <w:numId w:val="0"/>
+              </w:numPr>
+              <w:jc w:val="center"/>
+              <w:rPr>
+                <w:rFonts w:hint="default" w:ascii="Times New Roman" w:hAnsi="Times New Roman" w:eastAsia="SimSun"/>
+                <w:b w:val="0"/>
+                <w:bCs w:val="0"/>
+                <w:color w:val="auto"/>
+                <w:sz w:val="24"/>
+                <w:szCs w:val="24"/>
+                <w:vertAlign w:val="baseline"/>
+                <w:lang w:val="en-US"/>
+              </w:rPr>
+            </w:pPr>
+            <w:r>
+              <w:rPr>
+                <w:rFonts w:hint="default" w:ascii="Times New Roman" w:hAnsi="Times New Roman" w:eastAsia="SimSun"/>
+                <w:b w:val="0"/>
+                <w:bCs w:val="0"/>
+                <w:color w:val="auto"/>
+                <w:sz w:val="24"/>
+                <w:szCs w:val="24"/>
+                <w:vertAlign w:val="baseline"/>
+                <w:lang w:val="en-US"/>
+              </w:rPr>
+              <w:t>0.204</w:t>
+            </w:r>
+          </w:p>
+        </w:tc>
+      </w:tr>
+      <w:tr>
+        <w:tblPrEx>
+          <w:tblBorders>
+            <w:top w:val="single" w:color="auto" w:sz="4" w:space="0"/>
+            <w:left w:val="single" w:color="auto" w:sz="4" w:space="0"/>
+            <w:bottom w:val="single" w:color="auto" w:sz="4" w:space="0"/>
+            <w:right w:val="single" w:color="auto" w:sz="4" w:space="0"/>
+            <w:insideH w:val="single" w:color="auto" w:sz="4" w:space="0"/>
+            <w:insideV w:val="single" w:color="auto" w:sz="4" w:space="0"/>
+          </w:tblBorders>
+          <w:tblCellMar>
+            <w:left w:w="108" w:type="dxa"/>
+            <w:right w:w="108" w:type="dxa"/>
+          </w:tblCellMar>
+        </w:tblPrEx>
+        <w:tc>
+          <w:tcPr>
+            <w:tcW w:w="1704" w:type="dxa"/>
+            <w:vAlign w:val="center"/>
+          </w:tcPr>
+          <w:p>
+            <w:pPr>
+              <w:numPr>
+                <w:ilvl w:val="0"/>
+                <w:numId w:val="0"/>
+              </w:numPr>
+              <w:jc w:val="center"/>
+              <w:rPr>
+                <w:rFonts w:hint="default" w:ascii="Times New Roman" w:hAnsi="Times New Roman" w:eastAsia="SimSun"/>
+                <w:b w:val="0"/>
+                <w:bCs w:val="0"/>
+                <w:color w:val="auto"/>
+                <w:sz w:val="24"/>
+                <w:szCs w:val="24"/>
+                <w:vertAlign w:val="baseline"/>
+                <w:lang w:val="en-US"/>
+              </w:rPr>
+            </w:pPr>
+            <w:r>
+              <w:rPr>
+                <w:rFonts w:hint="default" w:ascii="Times New Roman" w:hAnsi="Times New Roman" w:eastAsia="SimSun"/>
+                <w:b w:val="0"/>
+                <w:bCs w:val="0"/>
+                <w:color w:val="auto"/>
+                <w:sz w:val="24"/>
+                <w:szCs w:val="24"/>
+                <w:vertAlign w:val="baseline"/>
+                <w:lang w:val="en-US"/>
+              </w:rPr>
+              <w:t>1990</w:t>
+            </w:r>
+          </w:p>
+        </w:tc>
+        <w:tc>
+          <w:tcPr>
+            <w:tcW w:w="1704" w:type="dxa"/>
+            <w:vAlign w:val="center"/>
+          </w:tcPr>
+          <w:p>
+            <w:pPr>
+              <w:numPr>
+                <w:ilvl w:val="0"/>
+                <w:numId w:val="0"/>
+              </w:numPr>
+              <w:jc w:val="center"/>
+              <w:rPr>
+                <w:rFonts w:hint="default" w:ascii="Times New Roman" w:hAnsi="Times New Roman" w:eastAsia="SimSun"/>
+                <w:b w:val="0"/>
+                <w:bCs w:val="0"/>
+                <w:color w:val="auto"/>
+                <w:sz w:val="24"/>
+                <w:szCs w:val="24"/>
+                <w:vertAlign w:val="baseline"/>
+                <w:lang w:val="en-US"/>
+              </w:rPr>
+            </w:pPr>
+            <w:r>
+              <w:rPr>
+                <w:rFonts w:hint="default" w:ascii="Times New Roman" w:hAnsi="Times New Roman" w:eastAsia="SimSun"/>
+                <w:b w:val="0"/>
+                <w:bCs w:val="0"/>
+                <w:color w:val="auto"/>
+                <w:sz w:val="24"/>
+                <w:szCs w:val="24"/>
+                <w:vertAlign w:val="baseline"/>
+                <w:lang w:val="en-US"/>
+              </w:rPr>
+              <w:t>23970</w:t>
+            </w:r>
+          </w:p>
+        </w:tc>
+        <w:tc>
+          <w:tcPr>
+            <w:tcW w:w="1704" w:type="dxa"/>
+            <w:vAlign w:val="center"/>
+          </w:tcPr>
+          <w:p>
+            <w:pPr>
+              <w:numPr>
+                <w:ilvl w:val="0"/>
+                <w:numId w:val="0"/>
+              </w:numPr>
+              <w:jc w:val="center"/>
+              <w:rPr>
+                <w:rFonts w:hint="default" w:ascii="Times New Roman" w:hAnsi="Times New Roman" w:eastAsia="SimSun"/>
+                <w:b w:val="0"/>
+                <w:bCs w:val="0"/>
+                <w:color w:val="auto"/>
+                <w:sz w:val="24"/>
+                <w:szCs w:val="24"/>
+                <w:vertAlign w:val="baseline"/>
+                <w:lang w:val="en-US"/>
+              </w:rPr>
+            </w:pPr>
+            <w:r>
+              <w:rPr>
+                <w:rFonts w:hint="default" w:ascii="Times New Roman" w:hAnsi="Times New Roman" w:eastAsia="SimSun"/>
+                <w:b w:val="0"/>
+                <w:bCs w:val="0"/>
+                <w:color w:val="auto"/>
+                <w:sz w:val="24"/>
+                <w:szCs w:val="24"/>
+                <w:vertAlign w:val="baseline"/>
+                <w:lang w:val="en-US"/>
+              </w:rPr>
+              <w:t>98.00 min</w:t>
+            </w:r>
+          </w:p>
+        </w:tc>
+        <w:tc>
+          <w:tcPr>
+            <w:tcW w:w="1705" w:type="dxa"/>
+            <w:vAlign w:val="center"/>
+          </w:tcPr>
+          <w:p>
+            <w:pPr>
+              <w:numPr>
+                <w:ilvl w:val="0"/>
+                <w:numId w:val="0"/>
+              </w:numPr>
+              <w:jc w:val="center"/>
+              <w:rPr>
+                <w:rFonts w:hint="default" w:ascii="Times New Roman" w:hAnsi="Times New Roman" w:eastAsia="SimSun"/>
+                <w:b w:val="0"/>
+                <w:bCs w:val="0"/>
+                <w:color w:val="auto"/>
+                <w:sz w:val="24"/>
+                <w:szCs w:val="24"/>
+                <w:vertAlign w:val="baseline"/>
+                <w:lang w:val="en-US"/>
+              </w:rPr>
+            </w:pPr>
+            <w:r>
+              <w:rPr>
+                <w:rFonts w:hint="default" w:ascii="Times New Roman" w:hAnsi="Times New Roman" w:eastAsia="SimSun"/>
+                <w:b w:val="0"/>
+                <w:bCs w:val="0"/>
+                <w:color w:val="auto"/>
+                <w:sz w:val="24"/>
+                <w:szCs w:val="24"/>
+                <w:vertAlign w:val="baseline"/>
+                <w:lang w:val="en-US"/>
+              </w:rPr>
+              <w:t>6.02</w:t>
+            </w:r>
+          </w:p>
+        </w:tc>
+        <w:tc>
+          <w:tcPr>
+            <w:tcW w:w="1705" w:type="dxa"/>
+            <w:vAlign w:val="center"/>
+          </w:tcPr>
+          <w:p>
+            <w:pPr>
+              <w:numPr>
+                <w:ilvl w:val="0"/>
+                <w:numId w:val="0"/>
+              </w:numPr>
+              <w:jc w:val="center"/>
+              <w:rPr>
+                <w:rFonts w:hint="default" w:ascii="Times New Roman" w:hAnsi="Times New Roman" w:eastAsia="SimSun"/>
+                <w:b w:val="0"/>
+                <w:bCs w:val="0"/>
+                <w:color w:val="auto"/>
+                <w:sz w:val="24"/>
+                <w:szCs w:val="24"/>
+                <w:vertAlign w:val="baseline"/>
+                <w:lang w:val="en-US"/>
+              </w:rPr>
+            </w:pPr>
+            <w:r>
+              <w:rPr>
+                <w:rFonts w:hint="default" w:ascii="Times New Roman" w:hAnsi="Times New Roman" w:eastAsia="SimSun"/>
+                <w:b w:val="0"/>
+                <w:bCs w:val="0"/>
+                <w:color w:val="auto"/>
+                <w:sz w:val="24"/>
+                <w:szCs w:val="24"/>
+                <w:vertAlign w:val="baseline"/>
+                <w:lang w:val="en-US"/>
+              </w:rPr>
+              <w:t>0.063</w:t>
+            </w:r>
+          </w:p>
+        </w:tc>
+      </w:tr>
+      <w:tr>
+        <w:tblPrEx>
+          <w:tblBorders>
+            <w:top w:val="single" w:color="auto" w:sz="4" w:space="0"/>
+            <w:left w:val="single" w:color="auto" w:sz="4" w:space="0"/>
+            <w:bottom w:val="single" w:color="auto" w:sz="4" w:space="0"/>
+            <w:right w:val="single" w:color="auto" w:sz="4" w:space="0"/>
+            <w:insideH w:val="single" w:color="auto" w:sz="4" w:space="0"/>
+            <w:insideV w:val="single" w:color="auto" w:sz="4" w:space="0"/>
+          </w:tblBorders>
+          <w:tblCellMar>
+            <w:left w:w="108" w:type="dxa"/>
+            <w:right w:w="108" w:type="dxa"/>
+          </w:tblCellMar>
+        </w:tblPrEx>
+        <w:tc>
+          <w:tcPr>
+            <w:tcW w:w="1704" w:type="dxa"/>
+            <w:vAlign w:val="center"/>
+          </w:tcPr>
+          <w:p>
+            <w:pPr>
+              <w:numPr>
+                <w:ilvl w:val="0"/>
+                <w:numId w:val="0"/>
+              </w:numPr>
+              <w:jc w:val="center"/>
+              <w:rPr>
+                <w:rFonts w:hint="default" w:ascii="Times New Roman" w:hAnsi="Times New Roman" w:eastAsia="SimSun"/>
+                <w:b w:val="0"/>
+                <w:bCs w:val="0"/>
+                <w:color w:val="auto"/>
+                <w:sz w:val="24"/>
+                <w:szCs w:val="24"/>
+                <w:vertAlign w:val="baseline"/>
+                <w:lang w:val="en-US"/>
+              </w:rPr>
+            </w:pPr>
+            <w:r>
+              <w:rPr>
+                <w:rFonts w:hint="default" w:ascii="Times New Roman" w:hAnsi="Times New Roman" w:eastAsia="SimSun"/>
+                <w:b w:val="0"/>
+                <w:bCs w:val="0"/>
+                <w:color w:val="auto"/>
+                <w:sz w:val="24"/>
+                <w:szCs w:val="24"/>
+                <w:vertAlign w:val="baseline"/>
+                <w:lang w:val="en-US"/>
+              </w:rPr>
+              <w:t>2010</w:t>
+            </w:r>
+          </w:p>
+        </w:tc>
+        <w:tc>
+          <w:tcPr>
+            <w:tcW w:w="1704" w:type="dxa"/>
+            <w:vAlign w:val="center"/>
+          </w:tcPr>
+          <w:p>
+            <w:pPr>
+              <w:numPr>
+                <w:ilvl w:val="0"/>
+                <w:numId w:val="0"/>
+              </w:numPr>
+              <w:jc w:val="center"/>
+              <w:rPr>
+                <w:rFonts w:hint="default" w:ascii="Times New Roman" w:hAnsi="Times New Roman" w:eastAsia="SimSun"/>
+                <w:b w:val="0"/>
+                <w:bCs w:val="0"/>
+                <w:color w:val="auto"/>
+                <w:sz w:val="24"/>
+                <w:szCs w:val="24"/>
+                <w:vertAlign w:val="baseline"/>
+                <w:lang w:val="en-US"/>
+              </w:rPr>
+            </w:pPr>
+            <w:r>
+              <w:rPr>
+                <w:rFonts w:hint="default" w:ascii="Times New Roman" w:hAnsi="Times New Roman" w:eastAsia="SimSun"/>
+                <w:b w:val="0"/>
+                <w:bCs w:val="0"/>
+                <w:color w:val="auto"/>
+                <w:sz w:val="24"/>
+                <w:szCs w:val="24"/>
+                <w:vertAlign w:val="baseline"/>
+                <w:lang w:val="en-US"/>
+              </w:rPr>
+              <w:t>88193</w:t>
+            </w:r>
+          </w:p>
+        </w:tc>
+        <w:tc>
+          <w:tcPr>
+            <w:tcW w:w="1704" w:type="dxa"/>
+            <w:vAlign w:val="center"/>
+          </w:tcPr>
+          <w:p>
+            <w:pPr>
+              <w:numPr>
+                <w:ilvl w:val="0"/>
+                <w:numId w:val="0"/>
+              </w:numPr>
+              <w:jc w:val="center"/>
+              <w:rPr>
+                <w:rFonts w:hint="default" w:ascii="Times New Roman" w:hAnsi="Times New Roman" w:eastAsia="SimSun"/>
+                <w:b w:val="0"/>
+                <w:bCs w:val="0"/>
+                <w:color w:val="auto"/>
+                <w:sz w:val="24"/>
+                <w:szCs w:val="24"/>
+                <w:vertAlign w:val="baseline"/>
+                <w:lang w:val="en-US"/>
+              </w:rPr>
+            </w:pPr>
+            <w:r>
+              <w:rPr>
+                <w:rFonts w:hint="default" w:ascii="Times New Roman" w:hAnsi="Times New Roman" w:eastAsia="SimSun"/>
+                <w:b w:val="0"/>
+                <w:bCs w:val="0"/>
+                <w:color w:val="auto"/>
+                <w:sz w:val="24"/>
+                <w:szCs w:val="24"/>
+                <w:vertAlign w:val="baseline"/>
+                <w:lang w:val="en-US"/>
+              </w:rPr>
+              <w:t>94.35 min</w:t>
+            </w:r>
+          </w:p>
+        </w:tc>
+        <w:tc>
+          <w:tcPr>
+            <w:tcW w:w="1705" w:type="dxa"/>
+            <w:vAlign w:val="center"/>
+          </w:tcPr>
+          <w:p>
+            <w:pPr>
+              <w:numPr>
+                <w:ilvl w:val="0"/>
+                <w:numId w:val="0"/>
+              </w:numPr>
+              <w:jc w:val="center"/>
+              <w:rPr>
+                <w:rFonts w:hint="default" w:ascii="Times New Roman" w:hAnsi="Times New Roman" w:eastAsia="SimSun"/>
+                <w:b w:val="0"/>
+                <w:bCs w:val="0"/>
+                <w:color w:val="auto"/>
+                <w:sz w:val="24"/>
+                <w:szCs w:val="24"/>
+                <w:vertAlign w:val="baseline"/>
+                <w:lang w:val="en-US"/>
+              </w:rPr>
+            </w:pPr>
+            <w:r>
+              <w:rPr>
+                <w:rFonts w:hint="default" w:ascii="Times New Roman" w:hAnsi="Times New Roman" w:eastAsia="SimSun"/>
+                <w:b w:val="0"/>
+                <w:bCs w:val="0"/>
+                <w:color w:val="auto"/>
+                <w:sz w:val="24"/>
+                <w:szCs w:val="24"/>
+                <w:vertAlign w:val="baseline"/>
+                <w:lang w:val="en-US"/>
+              </w:rPr>
+              <w:t>6.19</w:t>
+            </w:r>
+          </w:p>
+        </w:tc>
+        <w:tc>
+          <w:tcPr>
+            <w:tcW w:w="1705" w:type="dxa"/>
+            <w:vAlign w:val="center"/>
+          </w:tcPr>
+          <w:p>
+            <w:pPr>
+              <w:numPr>
+                <w:ilvl w:val="0"/>
+                <w:numId w:val="0"/>
+              </w:numPr>
+              <w:jc w:val="center"/>
+              <w:rPr>
+                <w:rFonts w:hint="default" w:ascii="Times New Roman" w:hAnsi="Times New Roman" w:eastAsia="SimSun"/>
+                <w:b w:val="0"/>
+                <w:bCs w:val="0"/>
+                <w:color w:val="auto"/>
+                <w:sz w:val="24"/>
+                <w:szCs w:val="24"/>
+                <w:vertAlign w:val="baseline"/>
+                <w:lang w:val="en-US"/>
+              </w:rPr>
+            </w:pPr>
+            <w:r>
+              <w:rPr>
+                <w:rFonts w:hint="default" w:ascii="Times New Roman" w:hAnsi="Times New Roman" w:eastAsia="SimSun"/>
+                <w:b w:val="0"/>
+                <w:bCs w:val="0"/>
+                <w:color w:val="auto"/>
+                <w:sz w:val="24"/>
+                <w:szCs w:val="24"/>
+                <w:vertAlign w:val="baseline"/>
+                <w:lang w:val="en-US"/>
+              </w:rPr>
+              <w:t>-0.004</w:t>
+            </w:r>
+          </w:p>
+        </w:tc>
+      </w:tr>
+      <w:tr>
+        <w:tblPrEx>
+          <w:tblBorders>
+            <w:top w:val="single" w:color="auto" w:sz="4" w:space="0"/>
+            <w:left w:val="single" w:color="auto" w:sz="4" w:space="0"/>
+            <w:bottom w:val="single" w:color="auto" w:sz="4" w:space="0"/>
+            <w:right w:val="single" w:color="auto" w:sz="4" w:space="0"/>
+            <w:insideH w:val="single" w:color="auto" w:sz="4" w:space="0"/>
+            <w:insideV w:val="single" w:color="auto" w:sz="4" w:space="0"/>
+          </w:tblBorders>
+          <w:tblCellMar>
+            <w:left w:w="108" w:type="dxa"/>
+            <w:right w:w="108" w:type="dxa"/>
+          </w:tblCellMar>
+        </w:tblPrEx>
+        <w:tc>
+          <w:tcPr>
+            <w:tcW w:w="1704" w:type="dxa"/>
+            <w:vAlign w:val="center"/>
+          </w:tcPr>
+          <w:p>
+            <w:pPr>
+              <w:numPr>
+                <w:ilvl w:val="0"/>
+                <w:numId w:val="0"/>
+              </w:numPr>
+              <w:jc w:val="center"/>
+              <w:rPr>
+                <w:rFonts w:hint="default" w:ascii="Times New Roman" w:hAnsi="Times New Roman" w:eastAsia="SimSun"/>
+                <w:b w:val="0"/>
+                <w:bCs w:val="0"/>
+                <w:color w:val="auto"/>
+                <w:sz w:val="24"/>
+                <w:szCs w:val="24"/>
+                <w:vertAlign w:val="baseline"/>
+                <w:lang w:val="en-US"/>
+              </w:rPr>
+            </w:pPr>
+            <w:r>
+              <w:rPr>
+                <w:rFonts w:hint="default" w:ascii="Times New Roman" w:hAnsi="Times New Roman" w:eastAsia="SimSun"/>
+                <w:b w:val="0"/>
+                <w:bCs w:val="0"/>
+                <w:color w:val="auto"/>
+                <w:sz w:val="24"/>
+                <w:szCs w:val="24"/>
+                <w:vertAlign w:val="baseline"/>
+                <w:lang w:val="en-US"/>
+              </w:rPr>
+              <w:t>2020</w:t>
+            </w:r>
+          </w:p>
+        </w:tc>
+        <w:tc>
+          <w:tcPr>
+            <w:tcW w:w="1704" w:type="dxa"/>
+            <w:vAlign w:val="center"/>
+          </w:tcPr>
+          <w:p>
+            <w:pPr>
+              <w:numPr>
+                <w:ilvl w:val="0"/>
+                <w:numId w:val="0"/>
+              </w:numPr>
+              <w:jc w:val="center"/>
+              <w:rPr>
+                <w:rFonts w:hint="default" w:ascii="Times New Roman" w:hAnsi="Times New Roman" w:eastAsia="SimSun"/>
+                <w:b w:val="0"/>
+                <w:bCs w:val="0"/>
+                <w:color w:val="auto"/>
+                <w:sz w:val="24"/>
+                <w:szCs w:val="24"/>
+                <w:vertAlign w:val="baseline"/>
+                <w:lang w:val="en-US"/>
+              </w:rPr>
+            </w:pPr>
+            <w:r>
+              <w:rPr>
+                <w:rFonts w:hint="default" w:ascii="Times New Roman" w:hAnsi="Times New Roman" w:eastAsia="SimSun"/>
+                <w:b w:val="0"/>
+                <w:bCs w:val="0"/>
+                <w:color w:val="auto"/>
+                <w:sz w:val="24"/>
+                <w:szCs w:val="24"/>
+                <w:vertAlign w:val="baseline"/>
+                <w:lang w:val="en-US"/>
+              </w:rPr>
+              <w:t>60353</w:t>
+            </w:r>
+          </w:p>
+        </w:tc>
+        <w:tc>
+          <w:tcPr>
+            <w:tcW w:w="1704" w:type="dxa"/>
+            <w:vAlign w:val="center"/>
+          </w:tcPr>
+          <w:p>
+            <w:pPr>
+              <w:numPr>
+                <w:ilvl w:val="0"/>
+                <w:numId w:val="0"/>
+              </w:numPr>
+              <w:jc w:val="center"/>
+              <w:rPr>
+                <w:rFonts w:hint="default" w:ascii="Times New Roman" w:hAnsi="Times New Roman" w:eastAsia="SimSun"/>
+                <w:b w:val="0"/>
+                <w:bCs w:val="0"/>
+                <w:color w:val="auto"/>
+                <w:sz w:val="24"/>
+                <w:szCs w:val="24"/>
+                <w:vertAlign w:val="baseline"/>
+                <w:lang w:val="en-US"/>
+              </w:rPr>
+            </w:pPr>
+            <w:r>
+              <w:rPr>
+                <w:rFonts w:hint="default" w:ascii="Times New Roman" w:hAnsi="Times New Roman" w:eastAsia="SimSun"/>
+                <w:b w:val="0"/>
+                <w:bCs w:val="0"/>
+                <w:color w:val="auto"/>
+                <w:sz w:val="24"/>
+                <w:szCs w:val="24"/>
+                <w:vertAlign w:val="baseline"/>
+                <w:lang w:val="en-US"/>
+              </w:rPr>
+              <w:t>97.22 min</w:t>
+            </w:r>
+          </w:p>
+        </w:tc>
+        <w:tc>
+          <w:tcPr>
+            <w:tcW w:w="1705" w:type="dxa"/>
+            <w:vAlign w:val="center"/>
+          </w:tcPr>
+          <w:p>
+            <w:pPr>
+              <w:numPr>
+                <w:ilvl w:val="0"/>
+                <w:numId w:val="0"/>
+              </w:numPr>
+              <w:jc w:val="center"/>
+              <w:rPr>
+                <w:rFonts w:hint="default" w:ascii="Times New Roman" w:hAnsi="Times New Roman" w:eastAsia="SimSun"/>
+                <w:b w:val="0"/>
+                <w:bCs w:val="0"/>
+                <w:color w:val="auto"/>
+                <w:sz w:val="24"/>
+                <w:szCs w:val="24"/>
+                <w:vertAlign w:val="baseline"/>
+                <w:lang w:val="en-US"/>
+              </w:rPr>
+            </w:pPr>
+            <w:r>
+              <w:rPr>
+                <w:rFonts w:hint="default" w:ascii="Times New Roman" w:hAnsi="Times New Roman" w:eastAsia="SimSun"/>
+                <w:b w:val="0"/>
+                <w:bCs w:val="0"/>
+                <w:color w:val="auto"/>
+                <w:sz w:val="24"/>
+                <w:szCs w:val="24"/>
+                <w:vertAlign w:val="baseline"/>
+                <w:lang w:val="en-US"/>
+              </w:rPr>
+              <w:t>6.22</w:t>
+            </w:r>
+          </w:p>
+        </w:tc>
+        <w:tc>
+          <w:tcPr>
+            <w:tcW w:w="1705" w:type="dxa"/>
+            <w:vAlign w:val="center"/>
+          </w:tcPr>
+          <w:p>
+            <w:pPr>
+              <w:numPr>
+                <w:ilvl w:val="0"/>
+                <w:numId w:val="0"/>
+              </w:numPr>
+              <w:jc w:val="center"/>
+              <w:rPr>
+                <w:rFonts w:hint="default" w:ascii="Times New Roman" w:hAnsi="Times New Roman" w:eastAsia="SimSun"/>
+                <w:b w:val="0"/>
+                <w:bCs w:val="0"/>
+                <w:color w:val="auto"/>
+                <w:sz w:val="24"/>
+                <w:szCs w:val="24"/>
+                <w:vertAlign w:val="baseline"/>
+                <w:lang w:val="en-US"/>
+              </w:rPr>
+            </w:pPr>
+            <w:r>
+              <w:rPr>
+                <w:rFonts w:hint="default" w:ascii="Times New Roman" w:hAnsi="Times New Roman" w:eastAsia="SimSun"/>
+                <w:b w:val="0"/>
+                <w:bCs w:val="0"/>
+                <w:color w:val="auto"/>
+                <w:sz w:val="24"/>
+                <w:szCs w:val="24"/>
+                <w:vertAlign w:val="baseline"/>
+                <w:lang w:val="en-US"/>
+              </w:rPr>
+              <w:t>-0.001</w:t>
+            </w:r>
+          </w:p>
+        </w:tc>
+      </w:tr>
+    </w:tbl>
+    <w:p>
+      <w:pPr>
+        <w:numPr>
+          <w:ilvl w:val="0"/>
+          <w:numId w:val="0"/>
+        </w:numPr>
+        <w:ind w:firstLine="720" w:firstLineChars="0"/>
+        <w:jc w:val="left"/>
+        <w:rPr>
+          <w:rFonts w:hint="default" w:ascii="Times New Roman" w:hAnsi="Times New Roman" w:eastAsia="SimSun"/>
+          <w:b w:val="0"/>
+          <w:bCs w:val="0"/>
+          <w:color w:val="auto"/>
+          <w:sz w:val="24"/>
+          <w:szCs w:val="24"/>
+          <w:lang w:val="en-US"/>
+        </w:rPr>
+      </w:pPr>
+    </w:p>
+    <w:p>
+      <w:pPr>
+        <w:spacing w:beforeLines="0" w:afterLines="0"/>
+        <w:jc w:val="left"/>
+        <w:rPr>
+          <w:rFonts w:hint="default" w:ascii="Times New Roman" w:hAnsi="Times New Roman" w:eastAsia="Consolas" w:cs="Times New Roman"/>
+          <w:color w:val="auto"/>
+          <w:sz w:val="24"/>
+          <w:szCs w:val="24"/>
+        </w:rPr>
+      </w:pPr>
+      <w:r>
+        <w:rPr>
+          <w:rFonts w:hint="default" w:ascii="Times New Roman" w:hAnsi="Times New Roman" w:eastAsia="SimSun"/>
+          <w:b/>
+          <w:bCs/>
+          <w:color w:val="auto"/>
+          <w:sz w:val="24"/>
+          <w:szCs w:val="24"/>
+          <w:lang w:val="en-US"/>
+        </w:rPr>
+        <w:t>Interpretation</w:t>
+      </w:r>
+      <w:r>
+        <w:rPr>
+          <w:rFonts w:hint="default" w:ascii="Times New Roman" w:hAnsi="Times New Roman" w:eastAsia="SimSun"/>
+          <w:b w:val="0"/>
+          <w:bCs w:val="0"/>
+          <w:color w:val="auto"/>
+          <w:sz w:val="24"/>
+          <w:szCs w:val="24"/>
+          <w:lang w:val="en-US"/>
+        </w:rPr>
+        <w:t xml:space="preserve">: </w:t>
+      </w:r>
+      <w:r>
+        <w:rPr>
+          <w:rFonts w:hint="default" w:ascii="Times New Roman" w:hAnsi="Times New Roman" w:eastAsia="Consolas" w:cs="Times New Roman"/>
+          <w:color w:val="auto"/>
+          <w:sz w:val="24"/>
+          <w:szCs w:val="24"/>
+        </w:rPr>
+        <w:t>Average movie runtime generally increased from about 80 minutes in the 1920s to about 97 minutes in the 2020s, although the trend is not strictly linear. Runtime showed a modest positive correlation with rating in several mid-century decades, but the correlation is close to zero in recent decades, suggesting that movie length currently has little linear relationship with IMDb rating.</w:t>
+      </w:r>
+    </w:p>
+    <w:p>
+      <w:pPr>
+        <w:numPr>
+          <w:ilvl w:val="0"/>
+          <w:numId w:val="0"/>
+        </w:numPr>
+        <w:ind w:firstLine="720" w:firstLineChars="0"/>
+        <w:jc w:val="left"/>
+        <w:rPr>
+          <w:rFonts w:hint="default" w:ascii="Times New Roman" w:hAnsi="Times New Roman" w:eastAsia="SimSun"/>
+          <w:b w:val="0"/>
+          <w:bCs w:val="0"/>
+          <w:color w:val="auto"/>
+          <w:sz w:val="24"/>
+          <w:szCs w:val="24"/>
+          <w:lang w:val="en-US"/>
+        </w:rPr>
+      </w:pPr>
+    </w:p>
+    <w:p>
+      <w:pPr>
+        <w:numPr>
           <w:ilvl w:val="0"/>
           <w:numId w:val="1"/>
         </w:numPr>
@@ -15030,8 +17330,6 @@
         </w:rPr>
         <w:t>DuckDB read_csv()</w:t>
       </w:r>
-      <w:bookmarkStart w:id="0" w:name="_GoBack"/>
-      <w:bookmarkEnd w:id="0"/>
     </w:p>
     <w:p>
       <w:pPr>
@@ -15367,9 +17665,18 @@
           <w:rFonts w:hint="default" w:ascii="Times New Roman" w:hAnsi="Times New Roman" w:cs="Times New Roman"/>
           <w:color w:val="auto"/>
         </w:rPr>
-        <w:t xml:space="preserve"> implementing a complete vertical slice first made debugging easier because the ingestion design could be validated before applying it to every dataset.</w:t>
+        <w:t xml:space="preserve"> implementing a complete vertical slice first made debugging easier </w:t>
+      </w:r>
+      <w:bookmarkStart w:id="0" w:name="_GoBack"/>
+      <w:r>
+        <w:rPr>
+          <w:rFonts w:hint="default" w:ascii="Times New Roman" w:hAnsi="Times New Roman" w:cs="Times New Roman"/>
+          <w:color w:val="auto"/>
+        </w:rPr>
+        <w:t>because the ingestion design could be validated before applying it to every dataset.</w:t>
       </w:r>
     </w:p>
+    <w:bookmarkEnd w:id="0"/>
     <w:p>
       <w:pPr>
         <w:pStyle w:val="7"/>

</xml_diff>